<commit_message>
Docs: update logic for Identity removal + credit-from-start; refresh .docx
Co-Authored-By: Claude Opus 4.8 (1M context) <noreply@anthropic.com>
</commit_message>
<xml_diff>
--- a/LOGIC.docx
+++ b/LOGIC.docx
@@ -1770,8 +1770,22 @@
         <w:t>balance = total earned − total spent</w:t>
       </w:r>
       <w:r>
-        <w:t xml:space="preserve">, recomputed from your logs. </w:t>
+        <w:t xml:space="preserve">. </w:t>
       </w:r>
+      <w:r>
+        <w:rPr>
+          <w:b/>
+        </w:rPr>
+        <w:t>Credits only count from the day Game Mode starts</w:t>
+      </w:r>
+      <w:r>
+        <w:t xml:space="preserve"> (not retroactively from your whole history), so there's never a phantom balance.</w:t>
+      </w:r>
+    </w:p>
+    <w:p>
+      <w:pPr>
+        <w:pStyle w:val="ListBullet"/>
+      </w:pPr>
       <w:r>
         <w:rPr>
           <w:b/>
@@ -1794,6 +1808,34 @@
       </w:r>
       <w:r>
         <w:t xml:space="preserve"> shows what your balance can afford (e.g. ☕×6).</w:t>
+      </w:r>
+    </w:p>
+    <w:p>
+      <w:pPr>
+        <w:pStyle w:val="ListBullet"/>
+      </w:pPr>
+      <w:r>
+        <w:rPr>
+          <w:b/>
+        </w:rPr>
+        <w:t>↺ Start fresh</w:t>
+      </w:r>
+      <w:r>
+        <w:t xml:space="preserve"> (in the card) re-zeroes the balance and banks forward from today; your logged data is untouched.</w:t>
+      </w:r>
+    </w:p>
+    <w:p>
+      <w:pPr>
+        <w:pStyle w:val="ListBullet"/>
+      </w:pPr>
+      <w:r>
+        <w:rPr>
+          <w:b/>
+        </w:rPr>
+        <w:t>Level</w:t>
+      </w:r>
+      <w:r>
+        <w:t xml:space="preserve"> rises with lifetime credits earned (~every ₹1,000 = +1).</w:t>
       </w:r>
     </w:p>
     <w:p>
@@ -2196,7 +2238,7 @@
         <w:t>Bronze 50% · Silver 65% · Gold 80% · Diamond 95%</w:t>
       </w:r>
       <w:r>
-        <w:t xml:space="preserve"> — each banks an escalating bonus, and </w:t>
+        <w:t xml:space="preserve"> — each banks an escalating bonus (₹300 / ₹600 / ₹1,200 / ₹2,000), and </w:t>
       </w:r>
       <w:r>
         <w:rPr>
@@ -2205,7 +2247,7 @@
         <w:t>Gold+ unlocks a 🍻 Night Out</w:t>
       </w:r>
       <w:r>
-        <w:t>. The bar adapts to the month's length.</w:t>
+        <w:t>. Needs at least 10 tracked days in the month before a tier is awarded.</w:t>
       </w:r>
     </w:p>
     <w:p>
@@ -2291,135 +2333,11 @@
       </w:r>
     </w:p>
     <w:p>
-      <w:pPr>
-        <w:pStyle w:val="Heading1"/>
-      </w:pPr>
-      <w:r>
-        <w:rPr>
-          <w:color w:val="2F7D5A"/>
-        </w:rPr>
-        <w:t>12. ✨ Identity XP (separate progression)</w:t>
-      </w:r>
-    </w:p>
-    <w:p>
-      <w:r>
-        <w:t xml:space="preserve">A self-directed system for </w:t>
-      </w:r>
-      <w:r>
-        <w:rPr>
-          <w:b/>
-        </w:rPr>
-        <w:t>becoming who you want to be</w:t>
-      </w:r>
-      <w:r>
-        <w:t xml:space="preserve"> — completely separate from the daily score and credits, </w:t>
-      </w:r>
-      <w:r>
-        <w:rPr>
-          <w:b/>
-        </w:rPr>
-        <w:t>never required</w:t>
-      </w:r>
-      <w:r>
-        <w:t xml:space="preserve">, pure bonus. XP drives your </w:t>
-      </w:r>
-      <w:r>
-        <w:rPr>
-          <w:b/>
-        </w:rPr>
-        <w:t>Level</w:t>
-      </w:r>
-      <w:r>
-        <w:t xml:space="preserve"> only (100 XP per level).</w:t>
-      </w:r>
-    </w:p>
-    <w:p>
-      <w:r>
-        <w:t xml:space="preserve">Tap to log (each can be done repeatedly): </w:t>
-      </w:r>
-      <w:r>
-        <w:rPr>
-          <w:b/>
-        </w:rPr>
-        <w:t>💼 Career</w:t>
-      </w:r>
-      <w:r>
-        <w:t xml:space="preserve"> (Apply +20 · Resume +30 · Interview +75 · New skill +40), </w:t>
-      </w:r>
-      <w:r>
-        <w:rPr>
-          <w:b/>
-        </w:rPr>
-        <w:t>💪 Health</w:t>
-      </w:r>
-      <w:r>
-        <w:t xml:space="preserve"> (Healthy meal +20 · 3L water +10 · No sugar +20 · Yoga +20), </w:t>
-      </w:r>
-      <w:r>
-        <w:rPr>
-          <w:b/>
-        </w:rPr>
-        <w:t>🏡 Life</w:t>
-      </w:r>
-      <w:r>
-        <w:t xml:space="preserve"> (Clean room +20 · Laundry +15 · Groceries +15 · Meal prep +20 · Declutter +20), </w:t>
-      </w:r>
-      <w:r>
-        <w:rPr>
-          <w:b/>
-        </w:rPr>
-        <w:t>✨ Self Care</w:t>
-      </w:r>
-      <w:r>
-        <w:t xml:space="preserve"> (Skincare +10 · Hair +15 · Grooming +15), </w:t>
-      </w:r>
-      <w:r>
-        <w:rPr>
-          <w:b/>
-        </w:rPr>
-        <w:t>🤝 Relationships</w:t>
-      </w:r>
-      <w:r>
-        <w:t xml:space="preserve"> (Call parents +15 · Family time +25 · Met a friend +20), </w:t>
-      </w:r>
-      <w:r>
-        <w:rPr>
-          <w:b/>
-        </w:rPr>
-        <w:t>🧠 Adulting</w:t>
-      </w:r>
-      <w:r>
-        <w:t xml:space="preserve"> (Budget +20 · Appointment +15 · Errand +20 · Documents +20).</w:t>
-      </w:r>
-    </w:p>
-    <w:p>
-      <w:r>
-        <w:rPr>
-          <w:b/>
-        </w:rPr>
-        <w:t>Cosmetic unlocks</w:t>
-      </w:r>
-      <w:r>
-        <w:t xml:space="preserve"> by level: 💍 Gold Ring (L5) · 🐰 New Bunny (L10) · 🎉 Confetti+ (L15) · 👑 Crown (L25).</w:t>
-      </w:r>
-    </w:p>
-    <w:p>
-      <w:r>
-        <w:rPr>
-          <w:b/>
-        </w:rPr>
-        <w:t>🏆 Hidden achievements</w:t>
-      </w:r>
-      <w:r>
-        <w:t xml:space="preserve"> unlock automatically (shown as 🔒 ??? until earned): First Application · Resume Master · Job Hunter · 🐦‍🔥 Phoenix (recovered from a slump) · Iron Soul (50 gym classes) · Quant Beast (1000 QA) · Unstoppable (30 winning days) · Perfect Week (7-day streak) · Big Saver (₹10k earned) · CAT Ready (readiness 80%+) · 👑 Level 25 · Glow Up · Certified Adult · 💎 Diamond Month.</w:t>
-      </w:r>
-    </w:p>
-    <w:p>
       <w:r>
         <w:rPr>
           <w:i/>
         </w:rPr>
-        <w:t>This document describes the logic as configured on 30 Jun 2026, including Game Mode v2 and Identity XP. If any rule changes, ask and I'll update this file.</w:t>
+        <w:t>This document describes the logic as configured on 30 Jun 2026, including Game Mode v2 (one credit currency, momentum, tiers, coach, buffs, recovery). If any rule changes, ask and I'll update this file.</w:t>
       </w:r>
     </w:p>
     <w:sectPr>

</xml_diff>